<commit_message>
feat(pert8): gate verifier + final rebuilt docx - 33/33 gates green
Post-processing added to build: A4 + 30/25mm margins (reference.docx ships
degenerate pgSz), TNR 12pt / 1.5 spacing / 1.25cm indent typography, and
image-extent repair (pandoc emits negative wp:extent for PyMuPDF PNGs).
Render-verified via Word COM -> PDF (17/7/8 pages, all exhibits in-margin).

Co-Authored-By: Claude Opus 4.8 (1M context) <noreply@anthropic.com>
</commit_message>
<xml_diff>
--- a/Critical Thinking of the Article/01079_Dzaki Muhammad Yusfian_Artikel 13.docx
+++ b/Critical Thinking of the Article/01079_Dzaki Muhammad Yusfian_Artikel 13.docx
@@ -471,7 +471,7 @@
       <w:r>
         <w:drawing>
           <wp:inline>
-            <wp:extent cx="-1816100" cy="-843511"/>
+            <wp:extent cx="4114800" cy="1911171"/>
             <wp:effectExtent b="0" l="0" r="0" t="0"/>
             <wp:docPr descr="Gambar 1. Interkoneksi pasar — identitas F∩N=G (Sumber: Kostruba &amp; Kostruba, 2025, hlm. 163)" title="" id="17" name="Picture"/>
             <a:graphic>
@@ -492,7 +492,7 @@
                   <pic:spPr bwMode="auto">
                     <a:xfrm>
                       <a:off x="0" y="0"/>
-                      <a:ext cx="-1816100" cy="-843511"/>
+                      <a:ext cx="4114800" cy="1911171"/>
                     </a:xfrm>
                     <a:prstGeom prst="rect">
                       <a:avLst/>
@@ -534,7 +534,7 @@
       <w:r>
         <w:drawing>
           <wp:inline>
-            <wp:extent cx="-1816100" cy="-968087"/>
+            <wp:extent cx="5303520" cy="2827082"/>
             <wp:effectExtent b="0" l="0" r="0" t="0"/>
             <wp:docPr descr="Gambar 2. Komponen lingkungan pemasaran internasional (Sumber: Kostruba &amp; Kostruba, 2025, hlm. 164)" title="" id="20" name="Picture"/>
             <a:graphic>
@@ -555,7 +555,7 @@
                   <pic:spPr bwMode="auto">
                     <a:xfrm>
                       <a:off x="0" y="0"/>
-                      <a:ext cx="-1816100" cy="-968087"/>
+                      <a:ext cx="5303520" cy="2827082"/>
                     </a:xfrm>
                     <a:prstGeom prst="rect">
                       <a:avLst/>
@@ -679,7 +679,7 @@
       <w:r>
         <w:drawing>
           <wp:inline>
-            <wp:extent cx="-1816100" cy="-622878"/>
+            <wp:extent cx="5303520" cy="1818975"/>
             <wp:effectExtent b="0" l="0" r="0" t="0"/>
             <wp:docPr descr="Tabel 1. Tiga kelompok strategi internasionalisasi (Sumber: Kostruba &amp; Kostruba, 2025, hlm. 167)" title="" id="24" name="Picture"/>
             <a:graphic>
@@ -700,7 +700,7 @@
                   <pic:spPr bwMode="auto">
                     <a:xfrm>
                       <a:off x="0" y="0"/>
-                      <a:ext cx="-1816100" cy="-622878"/>
+                      <a:ext cx="5303520" cy="1818975"/>
                     </a:xfrm>
                     <a:prstGeom prst="rect">
                       <a:avLst/>
@@ -1621,8 +1621,8 @@
     <w:bookmarkEnd w:id="36"/>
     <w:bookmarkEnd w:id="37"/>
     <w:sectPr>
-      <w:pgSz w:h="25" w:w="19"/>
-      <w:pgMar w:bottom="1440" w:footer="720" w:gutter="0" w:header="720" w:left="1440" w:right="1440" w:top="1440"/>
+      <w:pgSz w:h="16838" w:w="11906"/>
+      <w:pgMar w:bottom="1417" w:footer="720" w:gutter="0" w:header="720" w:left="1701" w:right="1417" w:top="1701"/>
       <w:cols w:space="720"/>
       <w:docGrid w:linePitch="360"/>
     </w:sectPr>
@@ -2097,12 +2097,12 @@
     <w:rsid w:val="00FC693F"/>
     <w:pPr>
       <w:jc w:val="both"/>
-      <w:spacing w:after="120" w:line="290" w:lineRule="atLeast"/>
-      <w:ind w:firstLine="360"/>
+      <w:spacing w:after="120" w:line="360" w:lineRule="auto"/>
+      <w:ind w:firstLine="709"/>
     </w:pPr>
     <w:rPr>
-      <w:rFonts w:ascii="Calibri" w:hAnsi="Calibri"/>
-      <w:sz w:val="22"/>
+      <w:rFonts w:ascii="Times New Roman" w:hAnsi="Times New Roman"/>
+      <w:sz w:val="24"/>
     </w:rPr>
   </w:style>
   <w:style w:styleId="Header" w:type="paragraph">
@@ -2160,14 +2160,14 @@
     <w:pPr>
       <w:keepNext/>
       <w:keepLines/>
-      <w:ind w:firstLine="0" w:left="0"/>
+      <w:ind w:left="0" w:firstLine="0"/>
       <w:jc w:val="left"/>
       <w:outlineLvl w:val="0"/>
       <w:shd w:color="auto" w:fill="FFFF00" w:val="clear"/>
       <w:spacing w:after="160" w:before="0"/>
     </w:pPr>
     <w:rPr>
-      <w:rFonts w:ascii="Calibri" w:asciiTheme="majorHAnsi" w:cstheme="majorBidi" w:eastAsiaTheme="majorEastAsia" w:hAnsi="Calibri" w:hAnsiTheme="majorHAnsi"/>
+      <w:rFonts w:ascii="Times New Roman" w:asciiTheme="majorHAnsi" w:cstheme="majorBidi" w:eastAsiaTheme="majorEastAsia" w:hAnsi="Times New Roman" w:hAnsiTheme="majorHAnsi"/>
       <w:b/>
       <w:bCs/>
       <w:color w:val="000000"/>
@@ -2188,17 +2188,17 @@
     <w:pPr>
       <w:keepNext/>
       <w:keepLines/>
-      <w:ind w:firstLine="0" w:left="0"/>
+      <w:ind w:left="0" w:firstLine="0"/>
       <w:jc w:val="left"/>
       <w:outlineLvl w:val="1"/>
       <w:spacing w:after="80" w:before="240"/>
     </w:pPr>
     <w:rPr>
-      <w:rFonts w:ascii="Calibri" w:asciiTheme="majorHAnsi" w:cstheme="majorBidi" w:eastAsiaTheme="majorEastAsia" w:hAnsi="Calibri" w:hAnsiTheme="majorHAnsi"/>
+      <w:rFonts w:ascii="Times New Roman" w:asciiTheme="majorHAnsi" w:cstheme="majorBidi" w:eastAsiaTheme="majorEastAsia" w:hAnsi="Times New Roman" w:hAnsiTheme="majorHAnsi"/>
       <w:b/>
       <w:bCs/>
       <w:color w:val="000000"/>
-      <w:sz w:val="22"/>
+      <w:sz w:val="24"/>
       <w:szCs w:val="22"/>
     </w:rPr>
   </w:style>
@@ -2214,18 +2214,18 @@
     <w:pPr>
       <w:keepNext/>
       <w:keepLines/>
-      <w:ind w:firstLine="0" w:left="0"/>
+      <w:ind w:left="0" w:firstLine="0"/>
       <w:jc w:val="left"/>
       <w:outlineLvl w:val="2"/>
       <w:spacing w:after="80" w:before="160"/>
     </w:pPr>
     <w:rPr>
-      <w:rFonts w:ascii="Calibri" w:asciiTheme="majorHAnsi" w:cstheme="majorBidi" w:eastAsiaTheme="majorEastAsia" w:hAnsi="Calibri" w:hAnsiTheme="majorHAnsi"/>
+      <w:rFonts w:ascii="Times New Roman" w:asciiTheme="majorHAnsi" w:cstheme="majorBidi" w:eastAsiaTheme="majorEastAsia" w:hAnsi="Times New Roman" w:hAnsiTheme="majorHAnsi"/>
       <w:b/>
       <w:bCs/>
       <w:i w:val="0"/>
       <w:color w:val="000000"/>
-      <w:sz w:val="22"/>
+      <w:sz w:val="24"/>
       <w:szCs w:val="22"/>
     </w:rPr>
   </w:style>
@@ -2910,12 +2910,14 @@
     <w:rsid w:val="00FC693F"/>
     <w:pPr>
       <w:spacing w:line="240" w:lineRule="auto"/>
+      <w:ind w:firstLine="0"/>
     </w:pPr>
     <w:rPr>
+      <w:rFonts w:ascii="Times New Roman" w:hAnsi="Times New Roman"/>
       <w:b/>
       <w:bCs/>
       <w:color w:themeColor="accent1" w:val="4F81BD"/>
-      <w:sz w:val="18"/>
+      <w:sz w:val="22"/>
       <w:szCs w:val="18"/>
     </w:rPr>
   </w:style>

</xml_diff>